<commit_message>
Align the mailing's price block with the site
Сентябрьская ступень показана закрытой: серая плашка, сумма
зачёркнута, подпись «бронь по этой цене закрыта». Ступень
«до 15 октября» стала текущей — тёмная плашка, оранжевые 6 000 ₽
и метка «Текущая цена», как на сайте.

Сумма в кнопке и в прехедере тоже 6 000 ₽. То же самое в текстовой
версии и в Word-версии: в генераторе priceRow вместо флага active
теперь состояние ступени — past, now или впереди.

Заодно поправлена цена в тексте под пост: там оставался
сентябрьский порог.

Co-Authored-By: Claude Opus 5 <noreply@anthropic.com>
Claude-Session: https://claude.ai/code/session_01XCRwUvHcbLyQVqQbnM8fyC
</commit_message>
<xml_diff>
--- a/email/Письмо-для-рассылки.docx
+++ b/email/Письмо-для-рассылки.docx
@@ -226,7 +226,7 @@
                 <w:sz w:val="20"/>
                 <w:szCs w:val="20"/>
               </w:rPr>
-              <w:t xml:space="preserve">13 ноября в Ростове семь практиков разбирают путь клиента по этапам. Зал на 60 мест, до 15 сентября — 5 000 ₽.</w:t>
+              <w:t xml:space="preserve">13 ноября в Ростове семь практиков разбирают путь клиента по этапам. Зал на 60 мест, до 15 октября — 6 000 ₽.</w:t>
             </w:r>
           </w:p>
         </w:tc>
@@ -1427,6 +1427,78 @@
               <w:bottom w:val="none" w:color="FFFFFF" w:sz="0"/>
               <w:right w:val="none" w:color="FFFFFF" w:sz="0"/>
             </w:tcBorders>
+            <w:shd w:fill="EDEEF4" w:color="auto" w:val="clear"/>
+            <w:tcMar>
+              <w:top w:type="dxa" w:w="90"/>
+              <w:left w:type="dxa" w:w="120"/>
+              <w:bottom w:type="dxa" w:w="90"/>
+              <w:right w:type="dxa" w:w="120"/>
+            </w:tcMar>
+          </w:tcPr>
+          <w:p>
+            <w:pPr>
+              <w:spacing w:after="0" w:before="0" w:line="276"/>
+            </w:pPr>
+            <w:r>
+              <w:rPr>
+                <w:rFonts w:ascii="Arial" w:cs="Arial" w:eastAsia="Arial" w:hAnsi="Arial"/>
+                <w:b w:val="false"/>
+                <w:bCs w:val="false"/>
+                <w:color w:val="78809F"/>
+                <w:sz w:val="21"/>
+                <w:szCs w:val="21"/>
+              </w:rPr>
+              <w:t xml:space="preserve">до 15 сентября  (бронь по этой цене закрыта)</w:t>
+            </w:r>
+          </w:p>
+        </w:tc>
+        <w:tc>
+          <w:tcPr>
+            <w:tcW w:type="dxa" w:w="3000"/>
+            <w:tcBorders>
+              <w:top w:val="none" w:color="FFFFFF" w:sz="0"/>
+              <w:left w:val="none" w:color="FFFFFF" w:sz="0"/>
+              <w:bottom w:val="none" w:color="FFFFFF" w:sz="0"/>
+              <w:right w:val="none" w:color="FFFFFF" w:sz="0"/>
+            </w:tcBorders>
+            <w:shd w:fill="EDEEF4" w:color="auto" w:val="clear"/>
+            <w:tcMar>
+              <w:top w:type="dxa" w:w="90"/>
+              <w:left w:type="dxa" w:w="120"/>
+              <w:bottom w:type="dxa" w:w="90"/>
+              <w:right w:type="dxa" w:w="120"/>
+            </w:tcMar>
+          </w:tcPr>
+          <w:p>
+            <w:pPr>
+              <w:spacing w:after="0" w:before="0" w:line="276"/>
+              <w:jc w:val="right"/>
+            </w:pPr>
+            <w:r>
+              <w:rPr>
+                <w:rFonts w:ascii="Arial" w:cs="Arial" w:eastAsia="Arial" w:hAnsi="Arial"/>
+                <w:b w:val="false"/>
+                <w:bCs w:val="false"/>
+                <w:strike/>
+                <w:color w:val="9AA3C2"/>
+                <w:sz w:val="21"/>
+                <w:szCs w:val="21"/>
+              </w:rPr>
+              <w:t xml:space="preserve">5 000 ₽</w:t>
+            </w:r>
+          </w:p>
+        </w:tc>
+      </w:tr>
+      <w:tr>
+        <w:tc>
+          <w:tcPr>
+            <w:tcW w:type="dxa" w:w="6638"/>
+            <w:tcBorders>
+              <w:top w:val="none" w:color="FFFFFF" w:sz="0"/>
+              <w:left w:val="none" w:color="FFFFFF" w:sz="0"/>
+              <w:bottom w:val="none" w:color="FFFFFF" w:sz="0"/>
+              <w:right w:val="none" w:color="FFFFFF" w:sz="0"/>
+            </w:tcBorders>
             <w:shd w:fill="0F1B4D" w:color="auto" w:val="clear"/>
             <w:tcMar>
               <w:top w:type="dxa" w:w="90"/>
@@ -1448,7 +1520,7 @@
                 <w:sz w:val="21"/>
                 <w:szCs w:val="21"/>
               </w:rPr>
-              <w:t xml:space="preserve">до 15 сентября</w:t>
+              <w:t xml:space="preserve">до 15 октября  (текущая цена)</w:t>
             </w:r>
           </w:p>
         </w:tc>
@@ -1479,11 +1551,12 @@
                 <w:rFonts w:ascii="Arial" w:cs="Arial" w:eastAsia="Arial" w:hAnsi="Arial"/>
                 <w:b/>
                 <w:bCs/>
+                <w:strike w:val="false"/>
                 <w:color w:val="E8622C"/>
                 <w:sz w:val="24"/>
                 <w:szCs w:val="24"/>
               </w:rPr>
-              <w:t xml:space="preserve">5 000 ₽</w:t>
+              <w:t xml:space="preserve">6 000 ₽</w:t>
             </w:r>
           </w:p>
         </w:tc>
@@ -1519,7 +1592,7 @@
                 <w:sz w:val="21"/>
                 <w:szCs w:val="21"/>
               </w:rPr>
-              <w:t xml:space="preserve">до 15 октября</w:t>
+              <w:t xml:space="preserve">до 13 ноября</w:t>
             </w:r>
           </w:p>
         </w:tc>
@@ -1550,77 +1623,7 @@
                 <w:rFonts w:ascii="Arial" w:cs="Arial" w:eastAsia="Arial" w:hAnsi="Arial"/>
                 <w:b/>
                 <w:bCs/>
-                <w:color w:val="12172E"/>
-                <w:sz w:val="21"/>
-                <w:szCs w:val="21"/>
-              </w:rPr>
-              <w:t xml:space="preserve">6 000 ₽</w:t>
-            </w:r>
-          </w:p>
-        </w:tc>
-      </w:tr>
-      <w:tr>
-        <w:tc>
-          <w:tcPr>
-            <w:tcW w:type="dxa" w:w="6638"/>
-            <w:tcBorders>
-              <w:top w:val="none" w:color="FFFFFF" w:sz="0"/>
-              <w:left w:val="none" w:color="FFFFFF" w:sz="0"/>
-              <w:bottom w:val="none" w:color="FFFFFF" w:sz="0"/>
-              <w:right w:val="none" w:color="FFFFFF" w:sz="0"/>
-            </w:tcBorders>
-            <w:shd w:fill="F2F3F7" w:color="auto" w:val="clear"/>
-            <w:tcMar>
-              <w:top w:type="dxa" w:w="90"/>
-              <w:left w:type="dxa" w:w="120"/>
-              <w:bottom w:type="dxa" w:w="90"/>
-              <w:right w:type="dxa" w:w="120"/>
-            </w:tcMar>
-          </w:tcPr>
-          <w:p>
-            <w:pPr>
-              <w:spacing w:after="0" w:before="0" w:line="276"/>
-            </w:pPr>
-            <w:r>
-              <w:rPr>
-                <w:rFonts w:ascii="Arial" w:cs="Arial" w:eastAsia="Arial" w:hAnsi="Arial"/>
-                <w:b w:val="false"/>
-                <w:bCs w:val="false"/>
-                <w:color w:val="12172E"/>
-                <w:sz w:val="21"/>
-                <w:szCs w:val="21"/>
-              </w:rPr>
-              <w:t xml:space="preserve">до 13 ноября</w:t>
-            </w:r>
-          </w:p>
-        </w:tc>
-        <w:tc>
-          <w:tcPr>
-            <w:tcW w:type="dxa" w:w="3000"/>
-            <w:tcBorders>
-              <w:top w:val="none" w:color="FFFFFF" w:sz="0"/>
-              <w:left w:val="none" w:color="FFFFFF" w:sz="0"/>
-              <w:bottom w:val="none" w:color="FFFFFF" w:sz="0"/>
-              <w:right w:val="none" w:color="FFFFFF" w:sz="0"/>
-            </w:tcBorders>
-            <w:shd w:fill="F2F3F7" w:color="auto" w:val="clear"/>
-            <w:tcMar>
-              <w:top w:type="dxa" w:w="90"/>
-              <w:left w:type="dxa" w:w="120"/>
-              <w:bottom w:type="dxa" w:w="90"/>
-              <w:right w:type="dxa" w:w="120"/>
-            </w:tcMar>
-          </w:tcPr>
-          <w:p>
-            <w:pPr>
-              <w:spacing w:after="0" w:before="0" w:line="276"/>
-              <w:jc w:val="right"/>
-            </w:pPr>
-            <w:r>
-              <w:rPr>
-                <w:rFonts w:ascii="Arial" w:cs="Arial" w:eastAsia="Arial" w:hAnsi="Arial"/>
-                <w:b/>
-                <w:bCs/>
+                <w:strike w:val="false"/>
                 <w:color w:val="12172E"/>
                 <w:sz w:val="21"/>
                 <w:szCs w:val="21"/>
@@ -1696,7 +1699,7 @@
                 <w:sz w:val="24"/>
                 <w:szCs w:val="24"/>
               </w:rPr>
-              <w:t xml:space="preserve">Забронировать место за 5 000 ₽</w:t>
+              <w:t xml:space="preserve">Забронировать место за 6 000 ₽</w:t>
             </w:r>
           </w:p>
         </w:tc>

</xml_diff>